<commit_message>
style: hacer fija la barra de navegacion superior al hacer scroll
</commit_message>
<xml_diff>
--- a/src/doc/Documentación del Proyecto.docx
+++ b/src/doc/Documentación del Proyecto.docx
@@ -255,37 +255,13 @@
           <w:b/>
           <w:bCs/>
         </w:rPr>
-        <w:t xml:space="preserve">Bitácora de </w:t>
-      </w:r>
-      <w:proofErr w:type="spellStart"/>
-      <w:r>
-        <w:rPr>
-          <w:rFonts w:ascii="Times New Roman" w:hAnsi="Times New Roman" w:cs="Times New Roman"/>
-          <w:b/>
-          <w:bCs/>
-        </w:rPr>
-        <w:t>Prompts</w:t>
-      </w:r>
-      <w:proofErr w:type="spellEnd"/>
-      <w:r>
-        <w:rPr>
-          <w:rFonts w:ascii="Times New Roman" w:hAnsi="Times New Roman" w:cs="Times New Roman"/>
-        </w:rPr>
-        <w:t xml:space="preserve"> para que puedas copiarla y pegarla en tu documento Word, Google </w:t>
-      </w:r>
-      <w:proofErr w:type="spellStart"/>
-      <w:r>
-        <w:rPr>
-          <w:rFonts w:ascii="Times New Roman" w:hAnsi="Times New Roman" w:cs="Times New Roman"/>
-        </w:rPr>
-        <w:t>Docs</w:t>
-      </w:r>
-      <w:proofErr w:type="spellEnd"/>
-      <w:r>
-        <w:rPr>
-          <w:rFonts w:ascii="Times New Roman" w:hAnsi="Times New Roman" w:cs="Times New Roman"/>
-        </w:rPr>
-        <w:t xml:space="preserve"> o cualquier procesador de texto sin problemas de formato:</w:t>
+        <w:t>Bitácora de Prompts</w:t>
+      </w:r>
+      <w:r>
+        <w:rPr>
+          <w:rFonts w:ascii="Times New Roman" w:hAnsi="Times New Roman" w:cs="Times New Roman"/>
+        </w:rPr>
+        <w:t xml:space="preserve"> para que puedas copiarla y pegarla en tu documento Word, Google Docs o cualquier procesador de texto sin problemas de formato:</w:t>
       </w:r>
     </w:p>
     <w:p>
@@ -315,18 +291,8 @@
           <w:b/>
           <w:bCs/>
         </w:rPr>
-        <w:t xml:space="preserve">B) Bitácora de </w:t>
-      </w:r>
-      <w:proofErr w:type="spellStart"/>
-      <w:r>
-        <w:rPr>
-          <w:rFonts w:ascii="Times New Roman" w:hAnsi="Times New Roman" w:cs="Times New Roman"/>
-          <w:b/>
-          <w:bCs/>
-        </w:rPr>
-        <w:t>Prompts</w:t>
-      </w:r>
-      <w:proofErr w:type="spellEnd"/>
+        <w:t>B) Bitácora de Prompts</w:t>
+      </w:r>
     </w:p>
     <w:p>
       <w:pPr>
@@ -360,115 +326,27 @@
           <w:rFonts w:ascii="Times New Roman" w:hAnsi="Times New Roman" w:cs="Times New Roman"/>
         </w:rPr>
       </w:pPr>
-      <w:proofErr w:type="spellStart"/>
-      <w:r>
-        <w:rPr>
-          <w:rFonts w:ascii="Times New Roman" w:hAnsi="Times New Roman" w:cs="Times New Roman"/>
-          <w:b/>
-          <w:bCs/>
-        </w:rPr>
-        <w:t>Prompt</w:t>
-      </w:r>
-      <w:proofErr w:type="spellEnd"/>
-      <w:r>
-        <w:rPr>
-          <w:rFonts w:ascii="Times New Roman" w:hAnsi="Times New Roman" w:cs="Times New Roman"/>
-          <w:b/>
-          <w:bCs/>
-        </w:rPr>
-        <w:t xml:space="preserve"> que escribiste:</w:t>
-      </w:r>
-    </w:p>
-    <w:p>
-      <w:pPr>
-        <w:rPr>
-          <w:rFonts w:ascii="Times New Roman" w:hAnsi="Times New Roman" w:cs="Times New Roman"/>
-        </w:rPr>
-      </w:pPr>
-      <w:r>
-        <w:rPr>
-          <w:rFonts w:ascii="Times New Roman" w:hAnsi="Times New Roman" w:cs="Times New Roman"/>
-        </w:rPr>
-        <w:t xml:space="preserve">Estoy creando una página web de una barbería llamada El Patrón </w:t>
-      </w:r>
-      <w:proofErr w:type="spellStart"/>
-      <w:r>
-        <w:rPr>
-          <w:rFonts w:ascii="Times New Roman" w:hAnsi="Times New Roman" w:cs="Times New Roman"/>
-        </w:rPr>
-        <w:t>Barbershop</w:t>
-      </w:r>
-      <w:proofErr w:type="spellEnd"/>
-      <w:r>
-        <w:rPr>
-          <w:rFonts w:ascii="Times New Roman" w:hAnsi="Times New Roman" w:cs="Times New Roman"/>
-        </w:rPr>
-        <w:t xml:space="preserve">, necesito una página principal donde venga publicidad de la barbería cortes y promociones, fechas de eventos donde estarán cortes a 2x1 </w:t>
-      </w:r>
-      <w:proofErr w:type="spellStart"/>
-      <w:r>
-        <w:rPr>
-          <w:rFonts w:ascii="Times New Roman" w:hAnsi="Times New Roman" w:cs="Times New Roman"/>
-        </w:rPr>
-        <w:t>tendra</w:t>
-      </w:r>
-      <w:proofErr w:type="spellEnd"/>
-      <w:r>
-        <w:rPr>
-          <w:rFonts w:ascii="Times New Roman" w:hAnsi="Times New Roman" w:cs="Times New Roman"/>
-        </w:rPr>
-        <w:t xml:space="preserve"> una página de </w:t>
-      </w:r>
-      <w:proofErr w:type="spellStart"/>
-      <w:r>
-        <w:rPr>
-          <w:rFonts w:ascii="Times New Roman" w:hAnsi="Times New Roman" w:cs="Times New Roman"/>
-        </w:rPr>
-        <w:t>login</w:t>
-      </w:r>
-      <w:proofErr w:type="spellEnd"/>
-      <w:r>
-        <w:rPr>
-          <w:rFonts w:ascii="Times New Roman" w:hAnsi="Times New Roman" w:cs="Times New Roman"/>
-        </w:rPr>
-        <w:t xml:space="preserve"> para ingresar y una pantalla administrativa la cual contiene un </w:t>
-      </w:r>
-      <w:proofErr w:type="spellStart"/>
-      <w:r>
-        <w:rPr>
-          <w:rFonts w:ascii="Times New Roman" w:hAnsi="Times New Roman" w:cs="Times New Roman"/>
-        </w:rPr>
-        <w:t>sidebar</w:t>
-      </w:r>
-      <w:proofErr w:type="spellEnd"/>
-      <w:r>
-        <w:rPr>
-          <w:rFonts w:ascii="Times New Roman" w:hAnsi="Times New Roman" w:cs="Times New Roman"/>
-        </w:rPr>
-        <w:t xml:space="preserve"> con varias opciones, calendario de citas, control de inventario, Registro de gastos Chat de </w:t>
-      </w:r>
-      <w:proofErr w:type="spellStart"/>
-      <w:r>
-        <w:rPr>
-          <w:rFonts w:ascii="Times New Roman" w:hAnsi="Times New Roman" w:cs="Times New Roman"/>
-        </w:rPr>
-        <w:t>Whatsapp</w:t>
-      </w:r>
-      <w:proofErr w:type="spellEnd"/>
-      <w:r>
-        <w:rPr>
-          <w:rFonts w:ascii="Times New Roman" w:hAnsi="Times New Roman" w:cs="Times New Roman"/>
-        </w:rPr>
-        <w:t xml:space="preserve"> para clientes que contacten, todo hecho con </w:t>
-      </w:r>
-      <w:proofErr w:type="spellStart"/>
-      <w:r>
-        <w:rPr>
-          <w:rFonts w:ascii="Times New Roman" w:hAnsi="Times New Roman" w:cs="Times New Roman"/>
-        </w:rPr>
-        <w:t>react</w:t>
-      </w:r>
-      <w:proofErr w:type="spellEnd"/>
+      <w:r>
+        <w:rPr>
+          <w:rFonts w:ascii="Times New Roman" w:hAnsi="Times New Roman" w:cs="Times New Roman"/>
+          <w:b/>
+          <w:bCs/>
+        </w:rPr>
+        <w:t>Prompt que escribiste:</w:t>
+      </w:r>
+    </w:p>
+    <w:p>
+      <w:pPr>
+        <w:rPr>
+          <w:rFonts w:ascii="Times New Roman" w:hAnsi="Times New Roman" w:cs="Times New Roman"/>
+        </w:rPr>
+      </w:pPr>
+      <w:r>
+        <w:rPr>
+          <w:rFonts w:ascii="Times New Roman" w:hAnsi="Times New Roman" w:cs="Times New Roman"/>
+        </w:rPr>
+        <w:t>Estoy creando una página web de una barbería llamada El Patrón Barbershop, necesito una página principal donde venga publicidad de la barbería cortes y promociones, fechas de eventos donde estarán cortes a 2x1 tendra una página de login para ingresar y una pantalla administrativa la cual contiene un sidebar con varias opciones, calendario de citas, control de inventario, Registro de gastos Chat de Whatsapp para clientes que contacten, todo hecho con react</w:t>
+      </w:r>
     </w:p>
     <w:p>
       <w:pPr>
@@ -499,21 +377,7 @@
         <w:rPr>
           <w:rFonts w:ascii="Times New Roman" w:hAnsi="Times New Roman" w:cs="Times New Roman"/>
         </w:rPr>
-        <w:t xml:space="preserve"> Generó el componente </w:t>
-      </w:r>
-      <w:proofErr w:type="spellStart"/>
-      <w:r>
-        <w:rPr>
-          <w:rFonts w:ascii="Times New Roman" w:hAnsi="Times New Roman" w:cs="Times New Roman"/>
-        </w:rPr>
-        <w:t>App.jsx</w:t>
-      </w:r>
-      <w:proofErr w:type="spellEnd"/>
-      <w:r>
-        <w:rPr>
-          <w:rFonts w:ascii="Times New Roman" w:hAnsi="Times New Roman" w:cs="Times New Roman"/>
-        </w:rPr>
-        <w:t xml:space="preserve"> con el formulario y la sección de lista, con estilos en un archivo CSS separado</w:t>
+        <w:t xml:space="preserve"> Generó el componente App.jsx con el formulario y la sección de lista, con estilos en un archivo CSS separado</w:t>
       </w:r>
       <w:r>
         <w:rPr>
@@ -551,35 +415,7 @@
         <w:rPr>
           <w:rFonts w:ascii="Times New Roman" w:hAnsi="Times New Roman" w:cs="Times New Roman"/>
         </w:rPr>
-        <w:t xml:space="preserve"> Revisión: Verifiqué que la estructura fuera clara. Se corrigió la anidación de carpetas en Git (El-</w:t>
-      </w:r>
-      <w:proofErr w:type="spellStart"/>
-      <w:r>
-        <w:rPr>
-          <w:rFonts w:ascii="Times New Roman" w:hAnsi="Times New Roman" w:cs="Times New Roman"/>
-        </w:rPr>
-        <w:t>patron</w:t>
-      </w:r>
-      <w:proofErr w:type="spellEnd"/>
-      <w:r>
-        <w:rPr>
-          <w:rFonts w:ascii="Times New Roman" w:hAnsi="Times New Roman" w:cs="Times New Roman"/>
-        </w:rPr>
-        <w:t>/El-</w:t>
-      </w:r>
-      <w:proofErr w:type="spellStart"/>
-      <w:r>
-        <w:rPr>
-          <w:rFonts w:ascii="Times New Roman" w:hAnsi="Times New Roman" w:cs="Times New Roman"/>
-        </w:rPr>
-        <w:t>patron</w:t>
-      </w:r>
-      <w:proofErr w:type="spellEnd"/>
-      <w:r>
-        <w:rPr>
-          <w:rFonts w:ascii="Times New Roman" w:hAnsi="Times New Roman" w:cs="Times New Roman"/>
-        </w:rPr>
-        <w:t xml:space="preserve">) y se unificaron las dependencias para evitar errores de importación. </w:t>
+        <w:t xml:space="preserve"> Revisión: Verifiqué que la estructura fuera clara. Se corrigió la anidación de carpetas en Git (El-patron/El-patron) y se unificaron las dependencias para evitar errores de importación. </w:t>
       </w:r>
       <w:r>
         <w:rPr>
@@ -606,23 +442,13 @@
           <w:rFonts w:ascii="Times New Roman" w:hAnsi="Times New Roman" w:cs="Times New Roman"/>
         </w:rPr>
       </w:pPr>
-      <w:proofErr w:type="spellStart"/>
-      <w:r>
-        <w:rPr>
-          <w:rFonts w:ascii="Times New Roman" w:hAnsi="Times New Roman" w:cs="Times New Roman"/>
-          <w:b/>
-          <w:bCs/>
-        </w:rPr>
-        <w:t>Prompt</w:t>
-      </w:r>
-      <w:proofErr w:type="spellEnd"/>
-      <w:r>
-        <w:rPr>
-          <w:rFonts w:ascii="Times New Roman" w:hAnsi="Times New Roman" w:cs="Times New Roman"/>
-          <w:b/>
-          <w:bCs/>
-        </w:rPr>
-        <w:t xml:space="preserve"> que escribiste:</w:t>
+      <w:r>
+        <w:rPr>
+          <w:rFonts w:ascii="Times New Roman" w:hAnsi="Times New Roman" w:cs="Times New Roman"/>
+          <w:b/>
+          <w:bCs/>
+        </w:rPr>
+        <w:t>Prompt que escribiste:</w:t>
       </w:r>
     </w:p>
     <w:p>
@@ -659,21 +485,7 @@
         <w:rPr>
           <w:rFonts w:ascii="Times New Roman" w:hAnsi="Times New Roman" w:cs="Times New Roman"/>
         </w:rPr>
-        <w:t xml:space="preserve">, todo debe estar </w:t>
-      </w:r>
-      <w:proofErr w:type="spellStart"/>
-      <w:r>
-        <w:rPr>
-          <w:rFonts w:ascii="Times New Roman" w:hAnsi="Times New Roman" w:cs="Times New Roman"/>
-        </w:rPr>
-        <w:t>linkeando</w:t>
-      </w:r>
-      <w:proofErr w:type="spellEnd"/>
-      <w:r>
-        <w:rPr>
-          <w:rFonts w:ascii="Times New Roman" w:hAnsi="Times New Roman" w:cs="Times New Roman"/>
-        </w:rPr>
-        <w:t xml:space="preserve"> de forma correcta para solo hacer </w:t>
+        <w:t xml:space="preserve">, todo debe estar linkeando de forma correcta para solo hacer </w:t>
       </w:r>
       <w:r>
         <w:rPr>
@@ -734,41 +546,13 @@
         <w:rPr>
           <w:rFonts w:ascii="Times New Roman" w:hAnsi="Times New Roman" w:cs="Times New Roman"/>
         </w:rPr>
-        <w:t xml:space="preserve"> Generó el componente </w:t>
-      </w:r>
-      <w:proofErr w:type="spellStart"/>
-      <w:r>
-        <w:rPr>
-          <w:rFonts w:ascii="Times New Roman" w:hAnsi="Times New Roman" w:cs="Times New Roman"/>
-        </w:rPr>
-        <w:t>App.jsx</w:t>
-      </w:r>
-      <w:proofErr w:type="spellEnd"/>
-      <w:r>
-        <w:rPr>
-          <w:rFonts w:ascii="Times New Roman" w:hAnsi="Times New Roman" w:cs="Times New Roman"/>
-        </w:rPr>
-        <w:t xml:space="preserve"> con el formulario y la sección de lista, con estilos en un archivo CSS separado</w:t>
-      </w:r>
-      <w:r>
-        <w:rPr>
-          <w:rFonts w:ascii="Times New Roman" w:hAnsi="Times New Roman" w:cs="Times New Roman"/>
-        </w:rPr>
-        <w:t xml:space="preserve">, además en Stich se generó el estilo, código, forma de la </w:t>
-      </w:r>
-      <w:proofErr w:type="spellStart"/>
-      <w:r>
-        <w:rPr>
-          <w:rFonts w:ascii="Times New Roman" w:hAnsi="Times New Roman" w:cs="Times New Roman"/>
-        </w:rPr>
-        <w:t>pagina</w:t>
-      </w:r>
-      <w:proofErr w:type="spellEnd"/>
-      <w:r>
-        <w:rPr>
-          <w:rFonts w:ascii="Times New Roman" w:hAnsi="Times New Roman" w:cs="Times New Roman"/>
-        </w:rPr>
-        <w:t xml:space="preserve"> y paleta de colores.</w:t>
+        <w:t xml:space="preserve"> Generó </w:t>
+      </w:r>
+      <w:r>
+        <w:rPr>
+          <w:rFonts w:ascii="Times New Roman" w:hAnsi="Times New Roman" w:cs="Times New Roman"/>
+        </w:rPr>
+        <w:t>la corrección de cada código para poder implementarlo, con la jerarquía en orden.</w:t>
       </w:r>
     </w:p>
     <w:p>
@@ -800,49 +584,18 @@
         <w:rPr>
           <w:rFonts w:ascii="Times New Roman" w:hAnsi="Times New Roman" w:cs="Times New Roman"/>
         </w:rPr>
-        <w:t xml:space="preserve"> Revisión: Verifiqué que la estructura fuera clara. Se corrigió la anidación de carpetas en Git (El-</w:t>
-      </w:r>
-      <w:proofErr w:type="spellStart"/>
-      <w:r>
-        <w:rPr>
-          <w:rFonts w:ascii="Times New Roman" w:hAnsi="Times New Roman" w:cs="Times New Roman"/>
-        </w:rPr>
-        <w:t>patron</w:t>
-      </w:r>
-      <w:proofErr w:type="spellEnd"/>
-      <w:r>
-        <w:rPr>
-          <w:rFonts w:ascii="Times New Roman" w:hAnsi="Times New Roman" w:cs="Times New Roman"/>
-        </w:rPr>
-        <w:t>/El-</w:t>
-      </w:r>
-      <w:proofErr w:type="spellStart"/>
-      <w:r>
-        <w:rPr>
-          <w:rFonts w:ascii="Times New Roman" w:hAnsi="Times New Roman" w:cs="Times New Roman"/>
-        </w:rPr>
-        <w:t>patron</w:t>
-      </w:r>
-      <w:proofErr w:type="spellEnd"/>
-      <w:r>
-        <w:rPr>
-          <w:rFonts w:ascii="Times New Roman" w:hAnsi="Times New Roman" w:cs="Times New Roman"/>
-        </w:rPr>
-        <w:t xml:space="preserve">) y se unificaron las dependencias para evitar errores de importación. </w:t>
-      </w:r>
-      <w:r>
-        <w:rPr>
-          <w:rFonts w:ascii="Times New Roman" w:hAnsi="Times New Roman" w:cs="Times New Roman"/>
-        </w:rPr>
-        <w:t>En Stich se corrigió estilo, jerarquía y diseño.</w:t>
-      </w:r>
-    </w:p>
-    <w:p>
-      <w:pPr>
-        <w:numPr>
-          <w:ilvl w:val="0"/>
-          <w:numId w:val="2"/>
-        </w:numPr>
+        <w:t xml:space="preserve"> Revisión: Verifiqué que la estructura fuera clara</w:t>
+      </w:r>
+      <w:r>
+        <w:rPr>
+          <w:rFonts w:ascii="Times New Roman" w:hAnsi="Times New Roman" w:cs="Times New Roman"/>
+        </w:rPr>
+        <w:t>, completa, que la jerarquía siguiera el orden correcto sin que de errores a la hora de implementar.</w:t>
+      </w:r>
+    </w:p>
+    <w:p>
+      <w:pPr>
+        <w:ind w:left="720"/>
         <w:rPr>
           <w:rFonts w:ascii="Times New Roman" w:hAnsi="Times New Roman" w:cs="Times New Roman"/>
         </w:rPr>
@@ -886,50 +639,26 @@
           <w:rFonts w:ascii="Times New Roman" w:hAnsi="Times New Roman" w:cs="Times New Roman"/>
         </w:rPr>
       </w:pPr>
-      <w:proofErr w:type="spellStart"/>
-      <w:r>
-        <w:rPr>
-          <w:rFonts w:ascii="Times New Roman" w:hAnsi="Times New Roman" w:cs="Times New Roman"/>
-          <w:b/>
-          <w:bCs/>
-        </w:rPr>
-        <w:t>Prompt</w:t>
-      </w:r>
-      <w:proofErr w:type="spellEnd"/>
-      <w:r>
-        <w:rPr>
-          <w:rFonts w:ascii="Times New Roman" w:hAnsi="Times New Roman" w:cs="Times New Roman"/>
-          <w:b/>
-          <w:bCs/>
-        </w:rPr>
-        <w:t xml:space="preserve"> que escribiste:</w:t>
-      </w:r>
-    </w:p>
-    <w:p>
-      <w:pPr>
-        <w:rPr>
-          <w:rFonts w:ascii="Times New Roman" w:hAnsi="Times New Roman" w:cs="Times New Roman"/>
-        </w:rPr>
-      </w:pPr>
-      <w:r>
-        <w:rPr>
-          <w:rFonts w:ascii="Times New Roman" w:hAnsi="Times New Roman" w:cs="Times New Roman"/>
-        </w:rPr>
-        <w:t xml:space="preserve">Agrega la lógica en </w:t>
-      </w:r>
-      <w:proofErr w:type="spellStart"/>
-      <w:r>
-        <w:rPr>
-          <w:rFonts w:ascii="Times New Roman" w:hAnsi="Times New Roman" w:cs="Times New Roman"/>
-        </w:rPr>
-        <w:t>React</w:t>
-      </w:r>
-      <w:proofErr w:type="spellEnd"/>
-      <w:r>
-        <w:rPr>
-          <w:rFonts w:ascii="Times New Roman" w:hAnsi="Times New Roman" w:cs="Times New Roman"/>
-        </w:rPr>
-        <w:t xml:space="preserve"> para capturar los datos del formulario, guardarlos en un estado array de objetos 'citas', mostrarlos en una tarjeta y permitir eliminar citas.</w:t>
+      <w:r>
+        <w:rPr>
+          <w:rFonts w:ascii="Times New Roman" w:hAnsi="Times New Roman" w:cs="Times New Roman"/>
+          <w:b/>
+          <w:bCs/>
+        </w:rPr>
+        <w:t>Prompt que escribiste:</w:t>
+      </w:r>
+    </w:p>
+    <w:p>
+      <w:pPr>
+        <w:rPr>
+          <w:rFonts w:ascii="Times New Roman" w:hAnsi="Times New Roman" w:cs="Times New Roman"/>
+        </w:rPr>
+      </w:pPr>
+      <w:r>
+        <w:rPr>
+          <w:rFonts w:ascii="Times New Roman" w:hAnsi="Times New Roman" w:cs="Times New Roman"/>
+        </w:rPr>
+        <w:t>Agrega la lógica en React para capturar los datos del formulario, guardarlos en un estado array de objetos 'citas', mostrarlos en una tarjeta y permitir eliminar citas.</w:t>
       </w:r>
     </w:p>
     <w:p>
@@ -961,35 +690,7 @@
         <w:rPr>
           <w:rFonts w:ascii="Times New Roman" w:hAnsi="Times New Roman" w:cs="Times New Roman"/>
         </w:rPr>
-        <w:t xml:space="preserve"> Agregó la función </w:t>
-      </w:r>
-      <w:proofErr w:type="spellStart"/>
-      <w:r>
-        <w:rPr>
-          <w:rFonts w:ascii="Times New Roman" w:hAnsi="Times New Roman" w:cs="Times New Roman"/>
-        </w:rPr>
-        <w:t>handleSubmit</w:t>
-      </w:r>
-      <w:proofErr w:type="spellEnd"/>
-      <w:r>
-        <w:rPr>
-          <w:rFonts w:ascii="Times New Roman" w:hAnsi="Times New Roman" w:cs="Times New Roman"/>
-        </w:rPr>
-        <w:t xml:space="preserve"> y la renderización con .</w:t>
-      </w:r>
-      <w:proofErr w:type="spellStart"/>
-      <w:r>
-        <w:rPr>
-          <w:rFonts w:ascii="Times New Roman" w:hAnsi="Times New Roman" w:cs="Times New Roman"/>
-        </w:rPr>
-        <w:t>map</w:t>
-      </w:r>
-      <w:proofErr w:type="spellEnd"/>
-      <w:r>
-        <w:rPr>
-          <w:rFonts w:ascii="Times New Roman" w:hAnsi="Times New Roman" w:cs="Times New Roman"/>
-        </w:rPr>
-        <w:t xml:space="preserve">(), junto con un botón para eliminar. </w:t>
+        <w:t xml:space="preserve"> Agregó la función handleSubmit y la renderización con .map(), junto con un botón para eliminar. </w:t>
       </w:r>
     </w:p>
     <w:p>
@@ -1021,21 +722,7 @@
         <w:rPr>
           <w:rFonts w:ascii="Times New Roman" w:hAnsi="Times New Roman" w:cs="Times New Roman"/>
         </w:rPr>
-        <w:t xml:space="preserve"> Revisión: Probé casos raros (campos vacíos). Corregí la falta de validación inicial añadiendo </w:t>
-      </w:r>
-      <w:proofErr w:type="spellStart"/>
-      <w:r>
-        <w:rPr>
-          <w:rFonts w:ascii="Times New Roman" w:hAnsi="Times New Roman" w:cs="Times New Roman"/>
-        </w:rPr>
-        <w:t>required</w:t>
-      </w:r>
-      <w:proofErr w:type="spellEnd"/>
-      <w:r>
-        <w:rPr>
-          <w:rFonts w:ascii="Times New Roman" w:hAnsi="Times New Roman" w:cs="Times New Roman"/>
-        </w:rPr>
-        <w:t xml:space="preserve"> en los inputs y previniendo citas duplicadas a la misma hora. </w:t>
+        <w:t xml:space="preserve"> Revisión: Probé casos raros (campos vacíos). Corregí la falta de validación inicial añadiendo required en los inputs y previniendo citas duplicadas a la misma hora. </w:t>
       </w:r>
     </w:p>
     <w:p>
@@ -1077,51 +764,26 @@
           <w:rFonts w:ascii="Times New Roman" w:hAnsi="Times New Roman" w:cs="Times New Roman"/>
         </w:rPr>
       </w:pPr>
-      <w:proofErr w:type="spellStart"/>
-      <w:r>
-        <w:rPr>
-          <w:rFonts w:ascii="Times New Roman" w:hAnsi="Times New Roman" w:cs="Times New Roman"/>
-          <w:b/>
-          <w:bCs/>
-        </w:rPr>
-        <w:t>Prompt</w:t>
-      </w:r>
-      <w:proofErr w:type="spellEnd"/>
-      <w:r>
-        <w:rPr>
-          <w:rFonts w:ascii="Times New Roman" w:hAnsi="Times New Roman" w:cs="Times New Roman"/>
-          <w:b/>
-          <w:bCs/>
-        </w:rPr>
-        <w:t xml:space="preserve"> que escribiste:</w:t>
-      </w:r>
-    </w:p>
-    <w:p>
-      <w:pPr>
-        <w:rPr>
-          <w:rFonts w:ascii="Times New Roman" w:hAnsi="Times New Roman" w:cs="Times New Roman"/>
-        </w:rPr>
-      </w:pPr>
-      <w:r>
-        <w:rPr>
-          <w:rFonts w:ascii="Times New Roman" w:hAnsi="Times New Roman" w:cs="Times New Roman"/>
-        </w:rPr>
-        <w:lastRenderedPageBreak/>
-        <w:t xml:space="preserve">Implementa </w:t>
-      </w:r>
-      <w:proofErr w:type="spellStart"/>
-      <w:r>
-        <w:rPr>
-          <w:rFonts w:ascii="Times New Roman" w:hAnsi="Times New Roman" w:cs="Times New Roman"/>
-        </w:rPr>
-        <w:t>localStorage</w:t>
-      </w:r>
-      <w:proofErr w:type="spellEnd"/>
-      <w:r>
-        <w:rPr>
-          <w:rFonts w:ascii="Times New Roman" w:hAnsi="Times New Roman" w:cs="Times New Roman"/>
-        </w:rPr>
-        <w:t xml:space="preserve"> para que la lista de citas no se pierda al recargar o cerrar la página.</w:t>
+      <w:r>
+        <w:rPr>
+          <w:rFonts w:ascii="Times New Roman" w:hAnsi="Times New Roman" w:cs="Times New Roman"/>
+          <w:b/>
+          <w:bCs/>
+        </w:rPr>
+        <w:t>Prompt que escribiste:</w:t>
+      </w:r>
+    </w:p>
+    <w:p>
+      <w:pPr>
+        <w:rPr>
+          <w:rFonts w:ascii="Times New Roman" w:hAnsi="Times New Roman" w:cs="Times New Roman"/>
+        </w:rPr>
+      </w:pPr>
+      <w:r>
+        <w:rPr>
+          <w:rFonts w:ascii="Times New Roman" w:hAnsi="Times New Roman" w:cs="Times New Roman"/>
+        </w:rPr>
+        <w:t>Implementa localStorage para que la lista de citas no se pierda al recargar o cerrar la página.</w:t>
       </w:r>
     </w:p>
     <w:p>
@@ -1160,49 +822,7 @@
         <w:rPr>
           <w:rFonts w:ascii="Times New Roman" w:hAnsi="Times New Roman" w:cs="Times New Roman"/>
         </w:rPr>
-        <w:t xml:space="preserve">Añadió </w:t>
-      </w:r>
-      <w:proofErr w:type="spellStart"/>
-      <w:r>
-        <w:rPr>
-          <w:rFonts w:ascii="Times New Roman" w:hAnsi="Times New Roman" w:cs="Times New Roman"/>
-        </w:rPr>
-        <w:t>hooks</w:t>
-      </w:r>
-      <w:proofErr w:type="spellEnd"/>
-      <w:r>
-        <w:rPr>
-          <w:rFonts w:ascii="Times New Roman" w:hAnsi="Times New Roman" w:cs="Times New Roman"/>
-        </w:rPr>
-        <w:t xml:space="preserve"> </w:t>
-      </w:r>
-      <w:proofErr w:type="spellStart"/>
-      <w:r>
-        <w:rPr>
-          <w:rFonts w:ascii="Times New Roman" w:hAnsi="Times New Roman" w:cs="Times New Roman"/>
-        </w:rPr>
-        <w:t>useEffect</w:t>
-      </w:r>
-      <w:proofErr w:type="spellEnd"/>
-      <w:r>
-        <w:rPr>
-          <w:rFonts w:ascii="Times New Roman" w:hAnsi="Times New Roman" w:cs="Times New Roman"/>
-        </w:rPr>
-        <w:t xml:space="preserve"> para cargar y guardar los datos en </w:t>
-      </w:r>
-      <w:proofErr w:type="spellStart"/>
-      <w:r>
-        <w:rPr>
-          <w:rFonts w:ascii="Times New Roman" w:hAnsi="Times New Roman" w:cs="Times New Roman"/>
-        </w:rPr>
-        <w:t>localStorage</w:t>
-      </w:r>
-      <w:proofErr w:type="spellEnd"/>
-      <w:r>
-        <w:rPr>
-          <w:rFonts w:ascii="Times New Roman" w:hAnsi="Times New Roman" w:cs="Times New Roman"/>
-        </w:rPr>
-        <w:t xml:space="preserve"> al cambiar el estado.</w:t>
+        <w:t>Añadió hooks useEffect para cargar y guardar los datos en localStorage al cambiar el estado.</w:t>
       </w:r>
     </w:p>
     <w:p>
@@ -1241,35 +861,7 @@
         <w:rPr>
           <w:rFonts w:ascii="Times New Roman" w:hAnsi="Times New Roman" w:cs="Times New Roman"/>
         </w:rPr>
-        <w:t xml:space="preserve">Revisión: Probé recargando el navegador. Corregí un fallo donde si </w:t>
-      </w:r>
-      <w:proofErr w:type="spellStart"/>
-      <w:r>
-        <w:rPr>
-          <w:rFonts w:ascii="Times New Roman" w:hAnsi="Times New Roman" w:cs="Times New Roman"/>
-        </w:rPr>
-        <w:t>localStorage</w:t>
-      </w:r>
-      <w:proofErr w:type="spellEnd"/>
-      <w:r>
-        <w:rPr>
-          <w:rFonts w:ascii="Times New Roman" w:hAnsi="Times New Roman" w:cs="Times New Roman"/>
-        </w:rPr>
-        <w:t xml:space="preserve"> estaba vacío devolvía </w:t>
-      </w:r>
-      <w:proofErr w:type="spellStart"/>
-      <w:r>
-        <w:rPr>
-          <w:rFonts w:ascii="Times New Roman" w:hAnsi="Times New Roman" w:cs="Times New Roman"/>
-        </w:rPr>
-        <w:t>null</w:t>
-      </w:r>
-      <w:proofErr w:type="spellEnd"/>
-      <w:r>
-        <w:rPr>
-          <w:rFonts w:ascii="Times New Roman" w:hAnsi="Times New Roman" w:cs="Times New Roman"/>
-        </w:rPr>
-        <w:t xml:space="preserve"> y rompía la app, inicializando el estado con un arreglo vacío [] por defecto.</w:t>
+        <w:t>Revisión: Probé recargando el navegador. Corregí un fallo donde si localStorage estaba vacío devolvía null y rompía la app, inicializando el estado con un arreglo vacío [] por defecto.</w:t>
       </w:r>
     </w:p>
     <w:p>
@@ -1317,23 +909,13 @@
           <w:rFonts w:ascii="Times New Roman" w:hAnsi="Times New Roman" w:cs="Times New Roman"/>
         </w:rPr>
       </w:pPr>
-      <w:proofErr w:type="spellStart"/>
-      <w:r>
-        <w:rPr>
-          <w:rFonts w:ascii="Times New Roman" w:hAnsi="Times New Roman" w:cs="Times New Roman"/>
-          <w:b/>
-          <w:bCs/>
-        </w:rPr>
-        <w:t>Prompt</w:t>
-      </w:r>
-      <w:proofErr w:type="spellEnd"/>
-      <w:r>
-        <w:rPr>
-          <w:rFonts w:ascii="Times New Roman" w:hAnsi="Times New Roman" w:cs="Times New Roman"/>
-          <w:b/>
-          <w:bCs/>
-        </w:rPr>
-        <w:t xml:space="preserve"> que escribiste:</w:t>
+      <w:r>
+        <w:rPr>
+          <w:rFonts w:ascii="Times New Roman" w:hAnsi="Times New Roman" w:cs="Times New Roman"/>
+          <w:b/>
+          <w:bCs/>
+        </w:rPr>
+        <w:t>Prompt que escribiste:</w:t>
       </w:r>
     </w:p>
     <w:p>
@@ -1484,35 +1066,7 @@
         <w:rPr>
           <w:rFonts w:ascii="Times New Roman" w:hAnsi="Times New Roman" w:cs="Times New Roman"/>
         </w:rPr>
-        <w:t xml:space="preserve">Sin el apoyo de una Inteligencia Artificial, configurar la estructura del proyecto en </w:t>
-      </w:r>
-      <w:proofErr w:type="spellStart"/>
-      <w:r>
-        <w:rPr>
-          <w:rFonts w:ascii="Times New Roman" w:hAnsi="Times New Roman" w:cs="Times New Roman"/>
-        </w:rPr>
-        <w:t>React</w:t>
-      </w:r>
-      <w:proofErr w:type="spellEnd"/>
-      <w:r>
-        <w:rPr>
-          <w:rFonts w:ascii="Times New Roman" w:hAnsi="Times New Roman" w:cs="Times New Roman"/>
-        </w:rPr>
-        <w:t xml:space="preserve">, diseñar los componentes desde cero, maquetar los estilos en CSS, integrar la persistencia en </w:t>
-      </w:r>
-      <w:proofErr w:type="spellStart"/>
-      <w:r>
-        <w:rPr>
-          <w:rFonts w:ascii="Times New Roman" w:hAnsi="Times New Roman" w:cs="Times New Roman"/>
-        </w:rPr>
-        <w:t>localStorage</w:t>
-      </w:r>
-      <w:proofErr w:type="spellEnd"/>
-      <w:r>
-        <w:rPr>
-          <w:rFonts w:ascii="Times New Roman" w:hAnsi="Times New Roman" w:cs="Times New Roman"/>
-        </w:rPr>
-        <w:t xml:space="preserve"> y calcular las métricas estadísticas me habría tomado aproximadamente entre </w:t>
+        <w:t xml:space="preserve">Sin el apoyo de una Inteligencia Artificial, configurar la estructura del proyecto en React, diseñar los componentes desde cero, maquetar los estilos en CSS, integrar la persistencia en localStorage y calcular las métricas estadísticas me habría tomado aproximadamente entre </w:t>
       </w:r>
       <w:r>
         <w:rPr>
@@ -1542,34 +1096,14 @@
         <w:lastRenderedPageBreak/>
         <w:t xml:space="preserve">Con la IA como copiloto bajo la metodología </w:t>
       </w:r>
-      <w:proofErr w:type="spellStart"/>
       <w:r>
         <w:rPr>
           <w:rFonts w:ascii="Times New Roman" w:hAnsi="Times New Roman" w:cs="Times New Roman"/>
           <w:i/>
           <w:iCs/>
         </w:rPr>
-        <w:t>Vibe</w:t>
-      </w:r>
-      <w:proofErr w:type="spellEnd"/>
-      <w:r>
-        <w:rPr>
-          <w:rFonts w:ascii="Times New Roman" w:hAnsi="Times New Roman" w:cs="Times New Roman"/>
-          <w:i/>
-          <w:iCs/>
-        </w:rPr>
-        <w:t xml:space="preserve"> </w:t>
-      </w:r>
-      <w:proofErr w:type="spellStart"/>
-      <w:r>
-        <w:rPr>
-          <w:rFonts w:ascii="Times New Roman" w:hAnsi="Times New Roman" w:cs="Times New Roman"/>
-          <w:i/>
-          <w:iCs/>
-        </w:rPr>
-        <w:t>Coding</w:t>
-      </w:r>
-      <w:proofErr w:type="spellEnd"/>
+        <w:t>Vibe Coding</w:t>
+      </w:r>
       <w:r>
         <w:rPr>
           <w:rFonts w:ascii="Times New Roman" w:hAnsi="Times New Roman" w:cs="Times New Roman"/>
@@ -1657,77 +1191,7 @@
         <w:rPr>
           <w:rFonts w:ascii="Times New Roman" w:hAnsi="Times New Roman" w:cs="Times New Roman"/>
         </w:rPr>
-        <w:t xml:space="preserve"> Al ejecutar comandos iniciales, la IA sugirió rutas que crearon una carpeta duplicada (El-</w:t>
-      </w:r>
-      <w:proofErr w:type="spellStart"/>
-      <w:r>
-        <w:rPr>
-          <w:rFonts w:ascii="Times New Roman" w:hAnsi="Times New Roman" w:cs="Times New Roman"/>
-        </w:rPr>
-        <w:t>patron</w:t>
-      </w:r>
-      <w:proofErr w:type="spellEnd"/>
-      <w:r>
-        <w:rPr>
-          <w:rFonts w:ascii="Times New Roman" w:hAnsi="Times New Roman" w:cs="Times New Roman"/>
-        </w:rPr>
-        <w:t>/El-</w:t>
-      </w:r>
-      <w:proofErr w:type="spellStart"/>
-      <w:r>
-        <w:rPr>
-          <w:rFonts w:ascii="Times New Roman" w:hAnsi="Times New Roman" w:cs="Times New Roman"/>
-        </w:rPr>
-        <w:t>patron</w:t>
-      </w:r>
-      <w:proofErr w:type="spellEnd"/>
-      <w:r>
-        <w:rPr>
-          <w:rFonts w:ascii="Times New Roman" w:hAnsi="Times New Roman" w:cs="Times New Roman"/>
-        </w:rPr>
-        <w:t>), lo que provocó errores de sincronización con el repositorio remoto de GitHub (</w:t>
-      </w:r>
-      <w:proofErr w:type="spellStart"/>
-      <w:r>
-        <w:rPr>
-          <w:rFonts w:ascii="Times New Roman" w:hAnsi="Times New Roman" w:cs="Times New Roman"/>
-        </w:rPr>
-        <w:t>rejected</w:t>
-      </w:r>
-      <w:proofErr w:type="spellEnd"/>
-      <w:r>
-        <w:rPr>
-          <w:rFonts w:ascii="Times New Roman" w:hAnsi="Times New Roman" w:cs="Times New Roman"/>
-        </w:rPr>
-        <w:t xml:space="preserve"> non-</w:t>
-      </w:r>
-      <w:proofErr w:type="spellStart"/>
-      <w:r>
-        <w:rPr>
-          <w:rFonts w:ascii="Times New Roman" w:hAnsi="Times New Roman" w:cs="Times New Roman"/>
-        </w:rPr>
-        <w:t>fast</w:t>
-      </w:r>
-      <w:proofErr w:type="spellEnd"/>
-      <w:r>
-        <w:rPr>
-          <w:rFonts w:ascii="Times New Roman" w:hAnsi="Times New Roman" w:cs="Times New Roman"/>
-        </w:rPr>
-        <w:t xml:space="preserve">-forward). Me di cuenta al ver la terminal bloqueada en estado </w:t>
-      </w:r>
-      <w:proofErr w:type="spellStart"/>
-      <w:r>
-        <w:rPr>
-          <w:rFonts w:ascii="Times New Roman" w:hAnsi="Times New Roman" w:cs="Times New Roman"/>
-        </w:rPr>
-        <w:t>Rebasing</w:t>
-      </w:r>
-      <w:proofErr w:type="spellEnd"/>
-      <w:r>
-        <w:rPr>
-          <w:rFonts w:ascii="Times New Roman" w:hAnsi="Times New Roman" w:cs="Times New Roman"/>
-        </w:rPr>
-        <w:t xml:space="preserve"> y el árbol de carpetas duplicado. </w:t>
+        <w:t xml:space="preserve"> Al ejecutar comandos iniciales, la IA sugirió rutas que crearon una carpeta duplicada (El-patron/El-patron), lo que provocó errores de sincronización con el repositorio remoto de GitHub (rejected non-fast-forward). Me di cuenta al ver la terminal bloqueada en estado Rebasing y el árbol de carpetas duplicado. </w:t>
       </w:r>
     </w:p>
     <w:p>
@@ -1752,105 +1216,7 @@
         <w:rPr>
           <w:rFonts w:ascii="Times New Roman" w:hAnsi="Times New Roman" w:cs="Times New Roman"/>
         </w:rPr>
-        <w:t xml:space="preserve"> Al sugerir el uso de </w:t>
-      </w:r>
-      <w:proofErr w:type="spellStart"/>
-      <w:r>
-        <w:rPr>
-          <w:rFonts w:ascii="Times New Roman" w:hAnsi="Times New Roman" w:cs="Times New Roman"/>
-        </w:rPr>
-        <w:t>localStorage</w:t>
-      </w:r>
-      <w:proofErr w:type="spellEnd"/>
-      <w:r>
-        <w:rPr>
-          <w:rFonts w:ascii="Times New Roman" w:hAnsi="Times New Roman" w:cs="Times New Roman"/>
-        </w:rPr>
-        <w:t>, no manejó adecuadamente la primera lectura sin datos previos, lo que causaba un error de ejecución (</w:t>
-      </w:r>
-      <w:proofErr w:type="spellStart"/>
-      <w:r>
-        <w:rPr>
-          <w:rFonts w:ascii="Times New Roman" w:hAnsi="Times New Roman" w:cs="Times New Roman"/>
-        </w:rPr>
-        <w:t>TypeError</w:t>
-      </w:r>
-      <w:proofErr w:type="spellEnd"/>
-      <w:r>
-        <w:rPr>
-          <w:rFonts w:ascii="Times New Roman" w:hAnsi="Times New Roman" w:cs="Times New Roman"/>
-        </w:rPr>
-        <w:t xml:space="preserve">: </w:t>
-      </w:r>
-      <w:proofErr w:type="spellStart"/>
-      <w:r>
-        <w:rPr>
-          <w:rFonts w:ascii="Times New Roman" w:hAnsi="Times New Roman" w:cs="Times New Roman"/>
-        </w:rPr>
-        <w:t>cannot</w:t>
-      </w:r>
-      <w:proofErr w:type="spellEnd"/>
-      <w:r>
-        <w:rPr>
-          <w:rFonts w:ascii="Times New Roman" w:hAnsi="Times New Roman" w:cs="Times New Roman"/>
-        </w:rPr>
-        <w:t xml:space="preserve"> </w:t>
-      </w:r>
-      <w:proofErr w:type="spellStart"/>
-      <w:r>
-        <w:rPr>
-          <w:rFonts w:ascii="Times New Roman" w:hAnsi="Times New Roman" w:cs="Times New Roman"/>
-        </w:rPr>
-        <w:t>read</w:t>
-      </w:r>
-      <w:proofErr w:type="spellEnd"/>
-      <w:r>
-        <w:rPr>
-          <w:rFonts w:ascii="Times New Roman" w:hAnsi="Times New Roman" w:cs="Times New Roman"/>
-        </w:rPr>
-        <w:t xml:space="preserve"> </w:t>
-      </w:r>
-      <w:proofErr w:type="spellStart"/>
-      <w:r>
-        <w:rPr>
-          <w:rFonts w:ascii="Times New Roman" w:hAnsi="Times New Roman" w:cs="Times New Roman"/>
-        </w:rPr>
-        <w:t>properties</w:t>
-      </w:r>
-      <w:proofErr w:type="spellEnd"/>
-      <w:r>
-        <w:rPr>
-          <w:rFonts w:ascii="Times New Roman" w:hAnsi="Times New Roman" w:cs="Times New Roman"/>
-        </w:rPr>
-        <w:t xml:space="preserve"> </w:t>
-      </w:r>
-      <w:proofErr w:type="spellStart"/>
-      <w:r>
-        <w:rPr>
-          <w:rFonts w:ascii="Times New Roman" w:hAnsi="Times New Roman" w:cs="Times New Roman"/>
-        </w:rPr>
-        <w:t>of</w:t>
-      </w:r>
-      <w:proofErr w:type="spellEnd"/>
-      <w:r>
-        <w:rPr>
-          <w:rFonts w:ascii="Times New Roman" w:hAnsi="Times New Roman" w:cs="Times New Roman"/>
-        </w:rPr>
-        <w:t xml:space="preserve"> </w:t>
-      </w:r>
-      <w:proofErr w:type="spellStart"/>
-      <w:r>
-        <w:rPr>
-          <w:rFonts w:ascii="Times New Roman" w:hAnsi="Times New Roman" w:cs="Times New Roman"/>
-        </w:rPr>
-        <w:t>null</w:t>
-      </w:r>
-      <w:proofErr w:type="spellEnd"/>
-      <w:r>
-        <w:rPr>
-          <w:rFonts w:ascii="Times New Roman" w:hAnsi="Times New Roman" w:cs="Times New Roman"/>
-        </w:rPr>
-        <w:t>). Lo detecté probando la aplicación en una pestaña de incógnito.</w:t>
+        <w:t xml:space="preserve"> Al sugerir el uso de localStorage, no manejó adecuadamente la primera lectura sin datos previos, lo que causaba un error de ejecución (TypeError: cannot read properties of null). Lo detecté probando la aplicación en una pestaña de incógnito.</w:t>
       </w:r>
     </w:p>
     <w:p>
@@ -1892,63 +1258,7 @@
         <w:rPr>
           <w:rFonts w:ascii="Times New Roman" w:hAnsi="Times New Roman" w:cs="Times New Roman"/>
         </w:rPr>
-        <w:t xml:space="preserve"> La generación rápida de componentes en </w:t>
-      </w:r>
-      <w:proofErr w:type="spellStart"/>
-      <w:r>
-        <w:rPr>
-          <w:rFonts w:ascii="Times New Roman" w:hAnsi="Times New Roman" w:cs="Times New Roman"/>
-        </w:rPr>
-        <w:t>React</w:t>
-      </w:r>
-      <w:proofErr w:type="spellEnd"/>
-      <w:r>
-        <w:rPr>
-          <w:rFonts w:ascii="Times New Roman" w:hAnsi="Times New Roman" w:cs="Times New Roman"/>
-        </w:rPr>
-        <w:t xml:space="preserve">, la redacción de CSS para el diseño visual, las funciones auxiliares de </w:t>
-      </w:r>
-      <w:proofErr w:type="spellStart"/>
-      <w:r>
-        <w:rPr>
-          <w:rFonts w:ascii="Times New Roman" w:hAnsi="Times New Roman" w:cs="Times New Roman"/>
-        </w:rPr>
-        <w:t>arrays</w:t>
-      </w:r>
-      <w:proofErr w:type="spellEnd"/>
-      <w:r>
-        <w:rPr>
-          <w:rFonts w:ascii="Times New Roman" w:hAnsi="Times New Roman" w:cs="Times New Roman"/>
-        </w:rPr>
-        <w:t xml:space="preserve"> (</w:t>
-      </w:r>
-      <w:proofErr w:type="spellStart"/>
-      <w:r>
-        <w:rPr>
-          <w:rFonts w:ascii="Times New Roman" w:hAnsi="Times New Roman" w:cs="Times New Roman"/>
-        </w:rPr>
-        <w:t>filter</w:t>
-      </w:r>
-      <w:proofErr w:type="spellEnd"/>
-      <w:r>
-        <w:rPr>
-          <w:rFonts w:ascii="Times New Roman" w:hAnsi="Times New Roman" w:cs="Times New Roman"/>
-        </w:rPr>
-        <w:t xml:space="preserve">, reduce, </w:t>
-      </w:r>
-      <w:proofErr w:type="spellStart"/>
-      <w:r>
-        <w:rPr>
-          <w:rFonts w:ascii="Times New Roman" w:hAnsi="Times New Roman" w:cs="Times New Roman"/>
-        </w:rPr>
-        <w:t>map</w:t>
-      </w:r>
-      <w:proofErr w:type="spellEnd"/>
-      <w:r>
-        <w:rPr>
-          <w:rFonts w:ascii="Times New Roman" w:hAnsi="Times New Roman" w:cs="Times New Roman"/>
-        </w:rPr>
-        <w:t xml:space="preserve">) y la sintaxis repetitiva. </w:t>
+        <w:t xml:space="preserve"> La generación rápida de componentes en React, la redacción de CSS para el diseño visual, las funciones auxiliares de arrays (filter, reduce, map) y la sintaxis repetitiva. </w:t>
       </w:r>
     </w:p>
     <w:p>
@@ -1973,21 +1283,7 @@
         <w:rPr>
           <w:rFonts w:ascii="Times New Roman" w:hAnsi="Times New Roman" w:cs="Times New Roman"/>
         </w:rPr>
-        <w:t xml:space="preserve"> La definición de la visión de negocio, la selección de los requisitos clave para el barbero, la toma de decisiones sobre la arquitectura Git (manejo de ramas como Angel y resolución de conflictos de </w:t>
-      </w:r>
-      <w:proofErr w:type="spellStart"/>
-      <w:r>
-        <w:rPr>
-          <w:rFonts w:ascii="Times New Roman" w:hAnsi="Times New Roman" w:cs="Times New Roman"/>
-        </w:rPr>
-        <w:t>push</w:t>
-      </w:r>
-      <w:proofErr w:type="spellEnd"/>
-      <w:r>
-        <w:rPr>
-          <w:rFonts w:ascii="Times New Roman" w:hAnsi="Times New Roman" w:cs="Times New Roman"/>
-        </w:rPr>
-        <w:t xml:space="preserve">), las pruebas de estrés (casos límite) y la validación de que el gráfico mostrara datos reales y útiles. </w:t>
+        <w:t xml:space="preserve"> La definición de la visión de negocio, la selección de los requisitos clave para el barbero, la toma de decisiones sobre la arquitectura Git (manejo de ramas como Angel y resolución de conflictos de push), las pruebas de estrés (casos límite) y la validación de que el gráfico mostrara datos reales y útiles. </w:t>
       </w:r>
     </w:p>
     <w:p>

</xml_diff>